<commit_message>
Add disser type shit
</commit_message>
<xml_diff>
--- a/dissertation/extended-summary/assets/title-pages.docx
+++ b/dissertation/extended-summary/assets/title-pages.docx
@@ -94,14 +94,14 @@
           <w:b/>
           <w:bCs/>
         </w:rPr>
-        <w:t>Методы и алгоритмы автоматизированного обнаружения противоречий в нормативных требованиях</w:t>
+        <w:t>Применение методов ИИ для определения противоречий и ограничений в умных стандартах, ссылочных стандартах и других нормативных документах</w:t>
       </w:r>
     </w:p>
     <w:p>
       <w:pPr>
         <w:pStyle w:val="BodyText"/>
         <w:bidi w:val="0"/>
-        <w:spacing w:before="0" w:after="1701"/>
+        <w:spacing w:before="0" w:after="1417"/>
         <w:jc w:val="center"/>
         <w:rPr/>
       </w:pPr>
@@ -122,7 +122,7 @@
       <w:pPr>
         <w:pStyle w:val="BodyText"/>
         <w:bidi w:val="0"/>
-        <w:spacing w:before="0" w:after="3969"/>
+        <w:spacing w:before="0" w:after="3685"/>
         <w:jc w:val="center"/>
         <w:rPr/>
       </w:pPr>
@@ -482,15 +482,15 @@
         </w:tblCellMar>
       </w:tblPr>
       <w:tblGrid>
-        <w:gridCol w:w="4127"/>
-        <w:gridCol w:w="2288"/>
+        <w:gridCol w:w="4126"/>
+        <w:gridCol w:w="2289"/>
         <w:gridCol w:w="3223"/>
       </w:tblGrid>
       <w:tr>
         <w:trPr/>
         <w:tc>
           <w:tcPr>
-            <w:tcW w:w="4127" w:type="dxa"/>
+            <w:tcW w:w="4126" w:type="dxa"/>
             <w:tcBorders/>
           </w:tcPr>
           <w:p>
@@ -526,7 +526,7 @@
         </w:tc>
         <w:tc>
           <w:tcPr>
-            <w:tcW w:w="2288" w:type="dxa"/>
+            <w:tcW w:w="2289" w:type="dxa"/>
             <w:tcBorders/>
           </w:tcPr>
           <w:p>
@@ -960,8 +960,8 @@
       <w:lang w:val="ru-RU" w:eastAsia="ru-RU" w:bidi="ru-RU"/>
     </w:rPr>
   </w:style>
-  <w:style w:type="character" w:styleId="FootnoteCharactersuser">
-    <w:name w:val="Footnote Characters (user)"/>
+  <w:style w:type="character" w:styleId="FootnoteCharacters">
+    <w:name w:val="Footnote Characters"/>
     <w:qFormat/>
     <w:rPr>
       <w:rFonts w:ascii="Times New Roman" w:hAnsi="Times New Roman" w:eastAsia="Times New Roman" w:cs="Times New Roman"/>
@@ -972,8 +972,8 @@
       <w:lang w:val="ru-RU" w:eastAsia="ru-RU" w:bidi="ru-RU"/>
     </w:rPr>
   </w:style>
-  <w:style w:type="character" w:styleId="FootnoteCharacters">
-    <w:name w:val="Footnote Characters"/>
+  <w:style w:type="character" w:styleId="FootnoteCharactersuser">
+    <w:name w:val="Footnote Characters (user)"/>
     <w:qFormat/>
     <w:rPr>
       <w:rFonts w:ascii="Times New Roman" w:hAnsi="Times New Roman" w:eastAsia="Times New Roman" w:cs="Times New Roman"/>

</xml_diff>